<commit_message>
Update report: Enhanced Long Sequence document
</commit_message>
<xml_diff>
--- a/📄 REPORT_ Enhanced Long Sequence Handling in BERT.docx
+++ b/📄 REPORT_ Enhanced Long Sequence Handling in BERT.docx
@@ -258,7 +258,47 @@
           <w:szCs w:val="26"/>
           <w:rtl w:val="0"/>
         </w:rPr>
-        <w:t xml:space="preserve">For reproducibility and further reference, the complete implementation notebook and experimental code have been made available in the GitHub repository: https://github.com/yourusername/bert-long-sequence-attention</w:t>
+        <w:t xml:space="preserve">For reproducibility and further reference, the complete implementation notebook and experimental code have been made available in the </w:t>
+      </w:r>
+      <w:hyperlink r:id="rId6">
+        <w:r>
+          <w:rPr>
+            <w:color w:val="1155cc"/>
+            <w:sz w:val="26"/>
+            <w:szCs w:val="26"/>
+            <w:u w:val="single"/>
+            <w:rtl w:val="0"/>
+          </w:rPr>
+          <w:t xml:space="preserve">GitHub repository</w:t>
+        </w:r>
+      </w:hyperlink>
+      <w:r>
+        <w:rPr>
+          <w:rtl w:val="0"/>
+        </w:rPr>
+      </w:r>
+    </w:p>
+    <w:p>
+      <w:pPr>
+        <w:spacing w:after="240" w:before="240" w:lineRule="auto"/>
+        <w:jc w:val="both"/>
+        <w:rPr>
+          <w:sz w:val="26"/>
+          <w:szCs w:val="26"/>
+        </w:rPr>
+      </w:pPr>
+      <w:r>
+        <w:rPr>
+          <w:sz w:val="26"/>
+          <w:szCs w:val="26"/>
+          <w:rtl w:val="0"/>
+        </w:rPr>
+        <w:t xml:space="preserve">https://github.com/satwic-sandilya/bert-long-sequence-attention.git</w:t>
+      </w:r>
+      <w:r>
+        <w:rPr>
+          <w:rtl w:val="0"/>
+        </w:rPr>
       </w:r>
     </w:p>
     <w:p>
@@ -640,7 +680,7 @@
                     <pic:cNvPicPr preferRelativeResize="0"/>
                   </pic:nvPicPr>
                   <pic:blipFill>
-                    <a:blip r:embed="rId6"/>
+                    <a:blip r:embed="rId7"/>
                     <a:srcRect b="0" l="0" r="0" t="0"/>
                     <a:stretch>
                       <a:fillRect/>
@@ -870,16 +910,16 @@
           <wp:inline distB="114300" distT="114300" distL="114300" distR="114300">
             <wp:extent cx="5491163" cy="1400175"/>
             <wp:effectExtent b="0" l="0" r="0" t="0"/>
-            <wp:docPr id="4" name="image3.png"/>
+            <wp:docPr id="4" name="image1.png"/>
             <a:graphic>
               <a:graphicData uri="http://schemas.openxmlformats.org/drawingml/2006/picture">
                 <pic:pic>
                   <pic:nvPicPr>
-                    <pic:cNvPr id="0" name="image3.png"/>
+                    <pic:cNvPr id="0" name="image1.png"/>
                     <pic:cNvPicPr preferRelativeResize="0"/>
                   </pic:nvPicPr>
                   <pic:blipFill>
-                    <a:blip r:embed="rId7"/>
+                    <a:blip r:embed="rId8"/>
                     <a:srcRect b="0" l="0" r="0" t="0"/>
                     <a:stretch>
                       <a:fillRect/>
@@ -1667,16 +1707,16 @@
           <wp:inline distB="114300" distT="114300" distL="114300" distR="114300">
             <wp:extent cx="6315075" cy="2349202"/>
             <wp:effectExtent b="0" l="0" r="0" t="0"/>
-            <wp:docPr id="1" name="image4.png"/>
+            <wp:docPr id="1" name="image3.png"/>
             <a:graphic>
               <a:graphicData uri="http://schemas.openxmlformats.org/drawingml/2006/picture">
                 <pic:pic>
                   <pic:nvPicPr>
-                    <pic:cNvPr id="0" name="image4.png"/>
+                    <pic:cNvPr id="0" name="image3.png"/>
                     <pic:cNvPicPr preferRelativeResize="0"/>
                   </pic:nvPicPr>
                   <pic:blipFill>
-                    <a:blip r:embed="rId8"/>
+                    <a:blip r:embed="rId9"/>
                     <a:srcRect b="0" l="0" r="0" t="0"/>
                     <a:stretch>
                       <a:fillRect/>
@@ -2603,16 +2643,16 @@
           <wp:inline distB="114300" distT="114300" distL="114300" distR="114300">
             <wp:extent cx="5200650" cy="1038225"/>
             <wp:effectExtent b="0" l="0" r="0" t="0"/>
-            <wp:docPr id="2" name="image1.png"/>
+            <wp:docPr id="2" name="image4.png"/>
             <a:graphic>
               <a:graphicData uri="http://schemas.openxmlformats.org/drawingml/2006/picture">
                 <pic:pic>
                   <pic:nvPicPr>
-                    <pic:cNvPr id="0" name="image1.png"/>
+                    <pic:cNvPr id="0" name="image4.png"/>
                     <pic:cNvPicPr preferRelativeResize="0"/>
                   </pic:nvPicPr>
                   <pic:blipFill>
-                    <a:blip r:embed="rId9"/>
+                    <a:blip r:embed="rId10"/>
                     <a:srcRect b="0" l="0" r="0" t="0"/>
                     <a:stretch>
                       <a:fillRect/>

</xml_diff>